<commit_message>
Add HIPAA landing page, 2 healthcare blog posts, HIPAA lead magnet email
- New /hipaa-compliance.html: dedicated landing page with pain points,
  services, 4-step process, penalty table, FAQ schema, Calendly CTAs
- New blog: HIPAA Risk Assessment Checklist 2026 (12-min SRA guide)
- New blog: What Happens During an OCR HIPAA Audit (10-min guide)
- Replace generic compliance checklist lead magnet email with
  HIPAA-specific 8-item checklist in /subscribe endpoint
- Update sitemap.xml with 3 new URLs (18 total)
- Update blog index with 2 new posts and HIPAA category
- Update operations guide and regenerate .docx

Co-Authored-By: Claude Opus 4.6 <noreply@anthropic.com>
</commit_message>
<xml_diff>
--- a/OPERATIONS-GUIDE.docx
+++ b/OPERATIONS-GUIDE.docx
@@ -533,9 +533,11 @@
         <w:br/>
         <w:t xml:space="preserve">    ├── index.html               # Main website (~140KB, single-page)</w:t>
         <w:br/>
-        <w:t xml:space="preserve">    ├── nyc-night.jpg            # NYC skyline photo for hero animation (~190KB)</w:t>
+        <w:t xml:space="preserve">    ├── hipaa-compliance.html     # Dedicated HIPAA landing page (SEO, FAQ schema, penalty table)</w:t>
         <w:br/>
         <w:t xml:space="preserve">    ├── ai-security-assessment.html # AI security assessment landing page</w:t>
+        <w:br/>
+        <w:t xml:space="preserve">    ├── nyc-night.jpg            # NYC skyline photo for hero animation (~190KB)</w:t>
         <w:br/>
         <w:t xml:space="preserve">    ├── 404.html                 # Custom 404 error page</w:t>
         <w:br/>
@@ -547,11 +549,15 @@
         <w:br/>
         <w:t xml:space="preserve">    ├── robots.txt               # Search engine crawling rules</w:t>
         <w:br/>
-        <w:t xml:space="preserve">    ├── sitemap.xml              # XML sitemap for SEO</w:t>
+        <w:t xml:space="preserve">    ├── sitemap.xml              # XML sitemap for SEO (18 URLs)</w:t>
         <w:br/>
-        <w:t xml:space="preserve">    └── blog/                    # SEO blog posts</w:t>
+        <w:t xml:space="preserve">    └── blog/                    # SEO blog posts (6 articles)</w:t>
         <w:br/>
-        <w:t xml:space="preserve">        ├── index.html           # Blog listing page</w:t>
+        <w:t xml:space="preserve">        ├── index.html           # Blog listing page with category filters</w:t>
+        <w:br/>
+        <w:t xml:space="preserve">        ├── hipaa-risk-assessment-checklist-2026.html    # HIPAA SRA checklist guide</w:t>
+        <w:br/>
+        <w:t xml:space="preserve">        ├── what-happens-during-ocr-hipaa-audit.html     # OCR audit process guide</w:t>
         <w:br/>
         <w:t xml:space="preserve">        ├── top-10-penetration-testing-findings-healthcare-2026.html</w:t>
         <w:br/>
@@ -1615,7 +1621,7 @@
                 <w:rFonts w:ascii="Calibri" w:hAnsi="Calibri"/>
                 <w:sz w:val="18"/>
               </w:rPr>
-              <w:t>Exit-intent email capture — sends compliance checklist + notifies consultant (rate-limited: 5/15min)</w:t>
+              <w:t>Exit-intent email capture — sends HIPAA compliance checklist + notifies consultant (rate-limited: 5/15min)</w:t>
             </w:r>
           </w:p>
         </w:tc>
@@ -8017,7 +8023,7 @@
     </w:p>
     <w:p>
       <w:r>
-        <w:t>Lists 13 URLs with image metadata:</w:t>
+        <w:t>Lists 18 URLs with image metadata:</w:t>
       </w:r>
     </w:p>
     <w:tbl>
@@ -8529,6 +8535,358 @@
                 <w:rFonts w:ascii="Calibri" w:hAnsi="Calibri"/>
                 <w:sz w:val="18"/>
               </w:rPr>
+              <w:t>`/hipaa-compliance.html`</w:t>
+            </w:r>
+          </w:p>
+        </w:tc>
+        <w:tc>
+          <w:tcPr>
+            <w:tcW w:type="dxa" w:w="2880"/>
+          </w:tcPr>
+          <w:p>
+            <w:r>
+              <w:rPr>
+                <w:rFonts w:ascii="Calibri" w:hAnsi="Calibri"/>
+                <w:sz w:val="18"/>
+              </w:rPr>
+              <w:t>0.9</w:t>
+            </w:r>
+          </w:p>
+        </w:tc>
+        <w:tc>
+          <w:tcPr>
+            <w:tcW w:type="dxa" w:w="2880"/>
+          </w:tcPr>
+          <w:p>
+            <w:r>
+              <w:rPr>
+                <w:rFonts w:ascii="Calibri" w:hAnsi="Calibri"/>
+                <w:sz w:val="18"/>
+              </w:rPr>
+              <w:t>monthly</w:t>
+            </w:r>
+          </w:p>
+        </w:tc>
+      </w:tr>
+      <w:tr>
+        <w:tc>
+          <w:tcPr>
+            <w:tcW w:type="dxa" w:w="2880"/>
+          </w:tcPr>
+          <w:p>
+            <w:r>
+              <w:rPr>
+                <w:rFonts w:ascii="Calibri" w:hAnsi="Calibri"/>
+                <w:sz w:val="18"/>
+              </w:rPr>
+              <w:t>`/blog/`</w:t>
+            </w:r>
+          </w:p>
+        </w:tc>
+        <w:tc>
+          <w:tcPr>
+            <w:tcW w:type="dxa" w:w="2880"/>
+          </w:tcPr>
+          <w:p>
+            <w:r>
+              <w:rPr>
+                <w:rFonts w:ascii="Calibri" w:hAnsi="Calibri"/>
+                <w:sz w:val="18"/>
+              </w:rPr>
+              <w:t>0.8</w:t>
+            </w:r>
+          </w:p>
+        </w:tc>
+        <w:tc>
+          <w:tcPr>
+            <w:tcW w:type="dxa" w:w="2880"/>
+          </w:tcPr>
+          <w:p>
+            <w:r>
+              <w:rPr>
+                <w:rFonts w:ascii="Calibri" w:hAnsi="Calibri"/>
+                <w:sz w:val="18"/>
+              </w:rPr>
+              <w:t>weekly</w:t>
+            </w:r>
+          </w:p>
+        </w:tc>
+      </w:tr>
+      <w:tr>
+        <w:tc>
+          <w:tcPr>
+            <w:tcW w:type="dxa" w:w="2880"/>
+          </w:tcPr>
+          <w:p>
+            <w:r>
+              <w:rPr>
+                <w:rFonts w:ascii="Calibri" w:hAnsi="Calibri"/>
+                <w:sz w:val="18"/>
+              </w:rPr>
+              <w:t>`/blog/hipaa-risk-assessment-checklist-2026.html`</w:t>
+            </w:r>
+          </w:p>
+        </w:tc>
+        <w:tc>
+          <w:tcPr>
+            <w:tcW w:type="dxa" w:w="2880"/>
+          </w:tcPr>
+          <w:p>
+            <w:r>
+              <w:rPr>
+                <w:rFonts w:ascii="Calibri" w:hAnsi="Calibri"/>
+                <w:sz w:val="18"/>
+              </w:rPr>
+              <w:t>0.7</w:t>
+            </w:r>
+          </w:p>
+        </w:tc>
+        <w:tc>
+          <w:tcPr>
+            <w:tcW w:type="dxa" w:w="2880"/>
+          </w:tcPr>
+          <w:p>
+            <w:r>
+              <w:rPr>
+                <w:rFonts w:ascii="Calibri" w:hAnsi="Calibri"/>
+                <w:sz w:val="18"/>
+              </w:rPr>
+              <w:t>monthly</w:t>
+            </w:r>
+          </w:p>
+        </w:tc>
+      </w:tr>
+      <w:tr>
+        <w:tc>
+          <w:tcPr>
+            <w:tcW w:type="dxa" w:w="2880"/>
+          </w:tcPr>
+          <w:p>
+            <w:r>
+              <w:rPr>
+                <w:rFonts w:ascii="Calibri" w:hAnsi="Calibri"/>
+                <w:sz w:val="18"/>
+              </w:rPr>
+              <w:t>`/blog/what-happens-during-ocr-hipaa-audit.html`</w:t>
+            </w:r>
+          </w:p>
+        </w:tc>
+        <w:tc>
+          <w:tcPr>
+            <w:tcW w:type="dxa" w:w="2880"/>
+          </w:tcPr>
+          <w:p>
+            <w:r>
+              <w:rPr>
+                <w:rFonts w:ascii="Calibri" w:hAnsi="Calibri"/>
+                <w:sz w:val="18"/>
+              </w:rPr>
+              <w:t>0.7</w:t>
+            </w:r>
+          </w:p>
+        </w:tc>
+        <w:tc>
+          <w:tcPr>
+            <w:tcW w:type="dxa" w:w="2880"/>
+          </w:tcPr>
+          <w:p>
+            <w:r>
+              <w:rPr>
+                <w:rFonts w:ascii="Calibri" w:hAnsi="Calibri"/>
+                <w:sz w:val="18"/>
+              </w:rPr>
+              <w:t>monthly</w:t>
+            </w:r>
+          </w:p>
+        </w:tc>
+      </w:tr>
+      <w:tr>
+        <w:tc>
+          <w:tcPr>
+            <w:tcW w:type="dxa" w:w="2880"/>
+          </w:tcPr>
+          <w:p>
+            <w:r>
+              <w:rPr>
+                <w:rFonts w:ascii="Calibri" w:hAnsi="Calibri"/>
+                <w:sz w:val="18"/>
+              </w:rPr>
+              <w:t>`/blog/top-10-penetration-testing-findings-healthcare-2026.html`</w:t>
+            </w:r>
+          </w:p>
+        </w:tc>
+        <w:tc>
+          <w:tcPr>
+            <w:tcW w:type="dxa" w:w="2880"/>
+          </w:tcPr>
+          <w:p>
+            <w:r>
+              <w:rPr>
+                <w:rFonts w:ascii="Calibri" w:hAnsi="Calibri"/>
+                <w:sz w:val="18"/>
+              </w:rPr>
+              <w:t>0.7</w:t>
+            </w:r>
+          </w:p>
+        </w:tc>
+        <w:tc>
+          <w:tcPr>
+            <w:tcW w:type="dxa" w:w="2880"/>
+          </w:tcPr>
+          <w:p>
+            <w:r>
+              <w:rPr>
+                <w:rFonts w:ascii="Calibri" w:hAnsi="Calibri"/>
+                <w:sz w:val="18"/>
+              </w:rPr>
+              <w:t>monthly</w:t>
+            </w:r>
+          </w:p>
+        </w:tc>
+      </w:tr>
+      <w:tr>
+        <w:tc>
+          <w:tcPr>
+            <w:tcW w:type="dxa" w:w="2880"/>
+          </w:tcPr>
+          <w:p>
+            <w:r>
+              <w:rPr>
+                <w:rFonts w:ascii="Calibri" w:hAnsi="Calibri"/>
+                <w:sz w:val="18"/>
+              </w:rPr>
+              <w:t>`/blog/navigating-cmmc-2-guide-defense-contractors.html`</w:t>
+            </w:r>
+          </w:p>
+        </w:tc>
+        <w:tc>
+          <w:tcPr>
+            <w:tcW w:type="dxa" w:w="2880"/>
+          </w:tcPr>
+          <w:p>
+            <w:r>
+              <w:rPr>
+                <w:rFonts w:ascii="Calibri" w:hAnsi="Calibri"/>
+                <w:sz w:val="18"/>
+              </w:rPr>
+              <w:t>0.7</w:t>
+            </w:r>
+          </w:p>
+        </w:tc>
+        <w:tc>
+          <w:tcPr>
+            <w:tcW w:type="dxa" w:w="2880"/>
+          </w:tcPr>
+          <w:p>
+            <w:r>
+              <w:rPr>
+                <w:rFonts w:ascii="Calibri" w:hAnsi="Calibri"/>
+                <w:sz w:val="18"/>
+              </w:rPr>
+              <w:t>monthly</w:t>
+            </w:r>
+          </w:p>
+        </w:tc>
+      </w:tr>
+      <w:tr>
+        <w:tc>
+          <w:tcPr>
+            <w:tcW w:type="dxa" w:w="2880"/>
+          </w:tcPr>
+          <w:p>
+            <w:r>
+              <w:rPr>
+                <w:rFonts w:ascii="Calibri" w:hAnsi="Calibri"/>
+                <w:sz w:val="18"/>
+              </w:rPr>
+              <w:t>`/blog/ai-security-risks-your-organization-is-ignoring.html`</w:t>
+            </w:r>
+          </w:p>
+        </w:tc>
+        <w:tc>
+          <w:tcPr>
+            <w:tcW w:type="dxa" w:w="2880"/>
+          </w:tcPr>
+          <w:p>
+            <w:r>
+              <w:rPr>
+                <w:rFonts w:ascii="Calibri" w:hAnsi="Calibri"/>
+                <w:sz w:val="18"/>
+              </w:rPr>
+              <w:t>0.7</w:t>
+            </w:r>
+          </w:p>
+        </w:tc>
+        <w:tc>
+          <w:tcPr>
+            <w:tcW w:type="dxa" w:w="2880"/>
+          </w:tcPr>
+          <w:p>
+            <w:r>
+              <w:rPr>
+                <w:rFonts w:ascii="Calibri" w:hAnsi="Calibri"/>
+                <w:sz w:val="18"/>
+              </w:rPr>
+              <w:t>monthly</w:t>
+            </w:r>
+          </w:p>
+        </w:tc>
+      </w:tr>
+      <w:tr>
+        <w:tc>
+          <w:tcPr>
+            <w:tcW w:type="dxa" w:w="2880"/>
+          </w:tcPr>
+          <w:p>
+            <w:r>
+              <w:rPr>
+                <w:rFonts w:ascii="Calibri" w:hAnsi="Calibri"/>
+                <w:sz w:val="18"/>
+              </w:rPr>
+              <w:t>`/blog/soc-2-in-8-weeks-saas-companies.html`</w:t>
+            </w:r>
+          </w:p>
+        </w:tc>
+        <w:tc>
+          <w:tcPr>
+            <w:tcW w:type="dxa" w:w="2880"/>
+          </w:tcPr>
+          <w:p>
+            <w:r>
+              <w:rPr>
+                <w:rFonts w:ascii="Calibri" w:hAnsi="Calibri"/>
+                <w:sz w:val="18"/>
+              </w:rPr>
+              <w:t>0.7</w:t>
+            </w:r>
+          </w:p>
+        </w:tc>
+        <w:tc>
+          <w:tcPr>
+            <w:tcW w:type="dxa" w:w="2880"/>
+          </w:tcPr>
+          <w:p>
+            <w:r>
+              <w:rPr>
+                <w:rFonts w:ascii="Calibri" w:hAnsi="Calibri"/>
+                <w:sz w:val="18"/>
+              </w:rPr>
+              <w:t>monthly</w:t>
+            </w:r>
+          </w:p>
+        </w:tc>
+      </w:tr>
+      <w:tr>
+        <w:tc>
+          <w:tcPr>
+            <w:tcW w:type="dxa" w:w="2880"/>
+          </w:tcPr>
+          <w:p>
+            <w:r>
+              <w:rPr>
+                <w:rFonts w:ascii="Calibri" w:hAnsi="Calibri"/>
+                <w:sz w:val="18"/>
+              </w:rPr>
               <w:t>`/privacy-policy.html`</w:t>
             </w:r>
           </w:p>
@@ -8675,7 +9033,7 @@
         <w:pStyle w:val="ListBullet"/>
       </w:pPr>
       <w:r>
-        <w:t>[ ] Google Search Console: Submit sitemap at https://search.google.com/search-console → Sitemaps → Add https://security.laurelshield.com/sitemap.xml</w:t>
+        <w:t>[ ] Google Search Console: Submit sitemap at `https://search.google.com/search-console` → Sitemaps → Add `https://security.laurelshield.com/sitemap.xml`</w:t>
       </w:r>
     </w:p>
     <w:p>
@@ -8691,7 +9049,7 @@
         <w:pStyle w:val="ListBullet"/>
       </w:pPr>
       <w:r>
-        <w:t>[ ] Bing Webmaster Tools: Submit sitemap at https://www.bing.com/webmasters</w:t>
+        <w:t>[ ] Bing Webmaster Tools: Submit sitemap at `https://www.bing.com/webmasters`</w:t>
       </w:r>
     </w:p>
     <w:p>
@@ -8699,7 +9057,7 @@
         <w:pStyle w:val="ListBullet"/>
       </w:pPr>
       <w:r>
-        <w:t>[ ] Yandex Webmaster: Submit at https://webmaster.yandex.com (for Russian/CIS traffic)</w:t>
+        <w:t>[ ] Yandex Webmaster: Submit at `https://webmaster.yandex.com` (for Russian/CIS traffic)</w:t>
       </w:r>
     </w:p>
     <w:p>
@@ -8715,7 +9073,7 @@
         <w:pStyle w:val="ListBullet"/>
       </w:pPr>
       <w:r>
-        <w:t>[ ] Social profiles: Create @LaurelShield on Twitter/X, LinkedIn, GitHub and add URLs to sameAs in JSON-LD</w:t>
+        <w:t>[ ] Social profiles: Create @LaurelShield on Twitter/X, LinkedIn, GitHub and add URLs to `sameAs` in JSON-LD</w:t>
       </w:r>
     </w:p>
     <w:p>
@@ -8723,7 +9081,7 @@
         <w:pStyle w:val="ListBullet"/>
       </w:pPr>
       <w:r>
-        <w:t>[ ] OG Image: Create and upload og-image.png (1200x630px) to the public/ folder</w:t>
+        <w:t>[ ] OG Image: Create and upload `og-image.png` (1200x630px) to the `public/` folder</w:t>
       </w:r>
     </w:p>
     <w:p>
@@ -11371,7 +11729,7 @@
         <w:pStyle w:val="ListBullet"/>
       </w:pPr>
       <w:r>
-        <w:t>[ ] .env file is in .gitignore (never commit API keys)</w:t>
+        <w:t>[ ] `.env` file is in `.gitignore` (never commit API keys)</w:t>
       </w:r>
     </w:p>
     <w:p>
@@ -11379,7 +11737,7 @@
         <w:pStyle w:val="ListBullet"/>
       </w:pPr>
       <w:r>
-        <w:t>[ ] RESEND_API_KEY is set only in environment variables, not in code</w:t>
+        <w:t>[ ] `RESEND_API_KEY` is set only in environment variables, not in code</w:t>
       </w:r>
     </w:p>
     <w:p>
@@ -11387,7 +11745,7 @@
         <w:pStyle w:val="ListBullet"/>
       </w:pPr>
       <w:r>
-        <w:t>[ ] Rate limiting is active on /contact endpoint</w:t>
+        <w:t>[ ] Rate limiting is active on `/contact` endpoint</w:t>
       </w:r>
     </w:p>
     <w:p>
@@ -11435,7 +11793,7 @@
         <w:pStyle w:val="ListBullet"/>
       </w:pPr>
       <w:r>
-        <w:t>[ ] Run npm audit monthly to check for dependency vulnerabilities</w:t>
+        <w:t>[ ] Run `npm audit` monthly to check for dependency vulnerabilities</w:t>
       </w:r>
     </w:p>
     <w:p>
@@ -11459,7 +11817,7 @@
         <w:pStyle w:val="ListBullet"/>
       </w:pPr>
       <w:r>
-        <w:t>[ ] Monitor /health endpoint uptime</w:t>
+        <w:t>[ ] Monitor `/health` endpoint uptime</w:t>
       </w:r>
     </w:p>
     <w:p>
@@ -12988,7 +13346,7 @@
     <w:rPr>
       <w:rFonts w:ascii="Calibri" w:hAnsi="Calibri"/>
       <w:color w:val="333333"/>
-      <w:sz w:val="18"/>
+      <w:sz w:val="22"/>
     </w:rPr>
   </w:style>
   <w:style w:type="paragraph" w:styleId="Header">

</xml_diff>